<commit_message>
Add UTM logo to Lab 1-4 report title pages
</commit_message>
<xml_diff>
--- a/lab1/Lab1_CatalinBitca_FAF-242.docx
+++ b/lab1/Lab1_CatalinBitca_FAF-242.docx
@@ -4,6 +4,49 @@
   <w:body>
     <w:p>
       <w:pPr>
+        <w:spacing w:before="0" w:after="160"/>
+        <w:jc w:val="center"/>
+      </w:pPr>
+      <w:r>
+        <w:drawing>
+          <wp:inline distT="0" distB="0" distL="0" distR="0">
+            <wp:extent cx="1224000" cy="655475"/>
+            <wp:effectExtent l="0" t="0" r="0" b="0"/>
+            <wp:docPr id="9001" name="UTM logo"/>
+            <wp:cNvGraphicFramePr>
+              <a:graphicFrameLocks xmlns:a="http://schemas.openxmlformats.org/drawingml/2006/main" noChangeAspect="1"/>
+            </wp:cNvGraphicFramePr>
+            <a:graphic xmlns:a="http://schemas.openxmlformats.org/drawingml/2006/main">
+              <a:graphicData uri="http://schemas.openxmlformats.org/drawingml/2006/picture">
+                <pic:pic xmlns:pic="http://schemas.openxmlformats.org/drawingml/2006/picture">
+                  <pic:nvPicPr>
+                    <pic:cNvPr id="9001" name="utm_logo.png"/>
+                    <pic:cNvPicPr/>
+                  </pic:nvPicPr>
+                  <pic:blipFill>
+                    <a:blip r:embed="rIdUtmLogo"/>
+                    <a:stretch>
+                      <a:fillRect/>
+                    </a:stretch>
+                  </pic:blipFill>
+                  <pic:spPr>
+                    <a:xfrm>
+                      <a:off x="0" y="0"/>
+                      <a:ext cx="1224000" cy="655475"/>
+                    </a:xfrm>
+                    <a:prstGeom prst="rect">
+                      <a:avLst/>
+                    </a:prstGeom>
+                  </pic:spPr>
+                </pic:pic>
+              </a:graphicData>
+            </a:graphic>
+          </wp:inline>
+        </w:drawing>
+      </w:r>
+    </w:p>
+    <w:p>
+      <w:pPr>
         <w:spacing w:after="0" w:before="0"/>
         <w:jc w:val="center"/>
       </w:pPr>
@@ -45,7 +88,7 @@
     </w:p>
     <w:p>
       <w:pPr>
-        <w:spacing w:after="0" w:before="3400"/>
+        <w:spacing w:after="0" w:before="2200"/>
         <w:jc w:val="center"/>
       </w:pPr>
       <w:r>

</xml_diff>